<commit_message>
fix(report): define list styles in the docx report templates
Rich-text fields reach the docx reports as HTML. Sablon renders <ul>/<ol>
with the paragraph styles ListBullet/ListNumber and needs a numbering
definition bound to each, which none of the shipped templates had: a
bulleted or numbered list in an analysis made the whole report fail.

Add both paragraph styles, with multi-level bullet and decimal/letter/roman
numbering, to Standard.docx, Supporting_information.docx and Spectra.docx
(the latter gets its numbering part). Specs check each template and render
a reaction report whose product analysis holds both list types.
</commit_message>
<xml_diff>
--- a/lib/template/Spectra.docx
+++ b/lib/template/Spectra.docx
@@ -731,6 +731,187 @@
     </w:sectPr>
   </w:body>
 </w:document>
+</file>
+
+<file path=word/numbering.xml><?xml version="1.0" encoding="utf-8"?>
+<w:numbering xmlns:w="http://schemas.openxmlformats.org/wordprocessingml/2006/main">
+  <w:abstractNum w:abstractNumId="0">
+    <w:multiLevelType w:val="hybridMultilevel"/>
+    <w:lvl w:ilvl="0">
+      <w:start w:val="1"/>
+      <w:numFmt w:val="bullet"/>
+      <w:pStyle w:val="ListBullet"/>
+      <w:lvlText w:val="•"/>
+      <w:lvlJc w:val="left"/>
+      <w:pPr>
+        <w:ind w:left="360" w:hanging="360"/>
+      </w:pPr>
+    </w:lvl>
+    <w:lvl w:ilvl="1">
+      <w:start w:val="1"/>
+      <w:numFmt w:val="bullet"/>
+      <w:lvlText w:val="◦"/>
+      <w:lvlJc w:val="left"/>
+      <w:pPr>
+        <w:ind w:left="720" w:hanging="360"/>
+      </w:pPr>
+    </w:lvl>
+    <w:lvl w:ilvl="2">
+      <w:start w:val="1"/>
+      <w:numFmt w:val="bullet"/>
+      <w:lvlText w:val="▪"/>
+      <w:lvlJc w:val="left"/>
+      <w:pPr>
+        <w:ind w:left="1080" w:hanging="360"/>
+      </w:pPr>
+    </w:lvl>
+    <w:lvl w:ilvl="3">
+      <w:start w:val="1"/>
+      <w:numFmt w:val="bullet"/>
+      <w:lvlText w:val="•"/>
+      <w:lvlJc w:val="left"/>
+      <w:pPr>
+        <w:ind w:left="1440" w:hanging="360"/>
+      </w:pPr>
+    </w:lvl>
+    <w:lvl w:ilvl="4">
+      <w:start w:val="1"/>
+      <w:numFmt w:val="bullet"/>
+      <w:lvlText w:val="◦"/>
+      <w:lvlJc w:val="left"/>
+      <w:pPr>
+        <w:ind w:left="1800" w:hanging="360"/>
+      </w:pPr>
+    </w:lvl>
+    <w:lvl w:ilvl="5">
+      <w:start w:val="1"/>
+      <w:numFmt w:val="bullet"/>
+      <w:lvlText w:val="▪"/>
+      <w:lvlJc w:val="left"/>
+      <w:pPr>
+        <w:ind w:left="2160" w:hanging="360"/>
+      </w:pPr>
+    </w:lvl>
+    <w:lvl w:ilvl="6">
+      <w:start w:val="1"/>
+      <w:numFmt w:val="bullet"/>
+      <w:lvlText w:val="•"/>
+      <w:lvlJc w:val="left"/>
+      <w:pPr>
+        <w:ind w:left="2520" w:hanging="360"/>
+      </w:pPr>
+    </w:lvl>
+    <w:lvl w:ilvl="7">
+      <w:start w:val="1"/>
+      <w:numFmt w:val="bullet"/>
+      <w:lvlText w:val="◦"/>
+      <w:lvlJc w:val="left"/>
+      <w:pPr>
+        <w:ind w:left="2880" w:hanging="360"/>
+      </w:pPr>
+    </w:lvl>
+    <w:lvl w:ilvl="8">
+      <w:start w:val="1"/>
+      <w:numFmt w:val="bullet"/>
+      <w:lvlText w:val="▪"/>
+      <w:lvlJc w:val="left"/>
+      <w:pPr>
+        <w:ind w:left="3240" w:hanging="360"/>
+      </w:pPr>
+    </w:lvl>
+  </w:abstractNum>
+  <w:abstractNum w:abstractNumId="1">
+    <w:multiLevelType w:val="hybridMultilevel"/>
+    <w:lvl w:ilvl="0">
+      <w:start w:val="1"/>
+      <w:numFmt w:val="decimal"/>
+      <w:pStyle w:val="ListNumber"/>
+      <w:lvlText w:val="%1."/>
+      <w:lvlJc w:val="left"/>
+      <w:pPr>
+        <w:ind w:left="360" w:hanging="360"/>
+      </w:pPr>
+    </w:lvl>
+    <w:lvl w:ilvl="1">
+      <w:start w:val="1"/>
+      <w:numFmt w:val="lowerLetter"/>
+      <w:lvlText w:val="%2."/>
+      <w:lvlJc w:val="left"/>
+      <w:pPr>
+        <w:ind w:left="720" w:hanging="360"/>
+      </w:pPr>
+    </w:lvl>
+    <w:lvl w:ilvl="2">
+      <w:start w:val="1"/>
+      <w:numFmt w:val="lowerRoman"/>
+      <w:lvlText w:val="%3."/>
+      <w:lvlJc w:val="left"/>
+      <w:pPr>
+        <w:ind w:left="1080" w:hanging="360"/>
+      </w:pPr>
+    </w:lvl>
+    <w:lvl w:ilvl="3">
+      <w:start w:val="1"/>
+      <w:numFmt w:val="decimal"/>
+      <w:lvlText w:val="%4."/>
+      <w:lvlJc w:val="left"/>
+      <w:pPr>
+        <w:ind w:left="1440" w:hanging="360"/>
+      </w:pPr>
+    </w:lvl>
+    <w:lvl w:ilvl="4">
+      <w:start w:val="1"/>
+      <w:numFmt w:val="lowerLetter"/>
+      <w:lvlText w:val="%5."/>
+      <w:lvlJc w:val="left"/>
+      <w:pPr>
+        <w:ind w:left="1800" w:hanging="360"/>
+      </w:pPr>
+    </w:lvl>
+    <w:lvl w:ilvl="5">
+      <w:start w:val="1"/>
+      <w:numFmt w:val="lowerRoman"/>
+      <w:lvlText w:val="%6."/>
+      <w:lvlJc w:val="left"/>
+      <w:pPr>
+        <w:ind w:left="2160" w:hanging="360"/>
+      </w:pPr>
+    </w:lvl>
+    <w:lvl w:ilvl="6">
+      <w:start w:val="1"/>
+      <w:numFmt w:val="decimal"/>
+      <w:lvlText w:val="%7."/>
+      <w:lvlJc w:val="left"/>
+      <w:pPr>
+        <w:ind w:left="2520" w:hanging="360"/>
+      </w:pPr>
+    </w:lvl>
+    <w:lvl w:ilvl="7">
+      <w:start w:val="1"/>
+      <w:numFmt w:val="lowerLetter"/>
+      <w:lvlText w:val="%8."/>
+      <w:lvlJc w:val="left"/>
+      <w:pPr>
+        <w:ind w:left="2880" w:hanging="360"/>
+      </w:pPr>
+    </w:lvl>
+    <w:lvl w:ilvl="8">
+      <w:start w:val="1"/>
+      <w:numFmt w:val="lowerRoman"/>
+      <w:lvlText w:val="%9."/>
+      <w:lvlJc w:val="left"/>
+      <w:pPr>
+        <w:ind w:left="3240" w:hanging="360"/>
+      </w:pPr>
+    </w:lvl>
+  </w:abstractNum>
+  <w:num w:numId="1">
+    <w:abstractNumId w:val="0"/>
+  </w:num>
+  <w:num w:numId="2">
+    <w:abstractNumId w:val="1"/>
+  </w:num>
+</w:numbering>
 </file>
 
 <file path=word/styles.xml><?xml version="1.0" encoding="utf-8"?>
@@ -1164,6 +1345,30 @@
     <w:semiHidden/>
     <w:unhideWhenUsed/>
   </w:style>
+  <w:style w:type="paragraph" w:styleId="ListBullet">
+    <w:name w:val="List Bullet"/>
+    <w:basedOn w:val="Normal"/>
+    <w:uiPriority w:val="99"/>
+    <w:unhideWhenUsed/>
+    <w:pPr>
+      <w:numPr>
+        <w:numId w:val="1"/>
+      </w:numPr>
+      <w:contextualSpacing/>
+    </w:pPr>
+  </w:style>
+  <w:style w:type="paragraph" w:styleId="ListNumber">
+    <w:name w:val="List Number"/>
+    <w:basedOn w:val="Normal"/>
+    <w:uiPriority w:val="99"/>
+    <w:unhideWhenUsed/>
+    <w:pPr>
+      <w:numPr>
+        <w:numId w:val="2"/>
+      </w:numPr>
+      <w:contextualSpacing/>
+    </w:pPr>
+  </w:style>
 </w:styles>
 </file>
 

</xml_diff>

<commit_message>
fix(report): define list styles in the docx report templates (#3638)
A docx report failed to generate when a selected element held a bulleted or
numbered list in a rich-text analysis: sablon renders such lists with the
ListBullet / ListNumber paragraph styles, which no shipped template defined.

- Standard.docx, Supporting_information.docx, Spectra.docx: add ListBullet and
  ListNumber styles with 9-level numbering definitions; Spectra.docx gains a
  word/numbering.xml part.
- Specs check every template defines both styles, and that a report with list
  content renders them.

Custom report templates fed rich text with lists need the same two styles.
</commit_message>
<xml_diff>
--- a/lib/template/Spectra.docx
+++ b/lib/template/Spectra.docx
@@ -731,6 +731,187 @@
     </w:sectPr>
   </w:body>
 </w:document>
+</file>
+
+<file path=word/numbering.xml><?xml version="1.0" encoding="utf-8"?>
+<w:numbering xmlns:w="http://schemas.openxmlformats.org/wordprocessingml/2006/main">
+  <w:abstractNum w:abstractNumId="0">
+    <w:multiLevelType w:val="hybridMultilevel"/>
+    <w:lvl w:ilvl="0">
+      <w:start w:val="1"/>
+      <w:numFmt w:val="bullet"/>
+      <w:pStyle w:val="ListBullet"/>
+      <w:lvlText w:val="•"/>
+      <w:lvlJc w:val="left"/>
+      <w:pPr>
+        <w:ind w:left="360" w:hanging="360"/>
+      </w:pPr>
+    </w:lvl>
+    <w:lvl w:ilvl="1">
+      <w:start w:val="1"/>
+      <w:numFmt w:val="bullet"/>
+      <w:lvlText w:val="◦"/>
+      <w:lvlJc w:val="left"/>
+      <w:pPr>
+        <w:ind w:left="720" w:hanging="360"/>
+      </w:pPr>
+    </w:lvl>
+    <w:lvl w:ilvl="2">
+      <w:start w:val="1"/>
+      <w:numFmt w:val="bullet"/>
+      <w:lvlText w:val="▪"/>
+      <w:lvlJc w:val="left"/>
+      <w:pPr>
+        <w:ind w:left="1080" w:hanging="360"/>
+      </w:pPr>
+    </w:lvl>
+    <w:lvl w:ilvl="3">
+      <w:start w:val="1"/>
+      <w:numFmt w:val="bullet"/>
+      <w:lvlText w:val="•"/>
+      <w:lvlJc w:val="left"/>
+      <w:pPr>
+        <w:ind w:left="1440" w:hanging="360"/>
+      </w:pPr>
+    </w:lvl>
+    <w:lvl w:ilvl="4">
+      <w:start w:val="1"/>
+      <w:numFmt w:val="bullet"/>
+      <w:lvlText w:val="◦"/>
+      <w:lvlJc w:val="left"/>
+      <w:pPr>
+        <w:ind w:left="1800" w:hanging="360"/>
+      </w:pPr>
+    </w:lvl>
+    <w:lvl w:ilvl="5">
+      <w:start w:val="1"/>
+      <w:numFmt w:val="bullet"/>
+      <w:lvlText w:val="▪"/>
+      <w:lvlJc w:val="left"/>
+      <w:pPr>
+        <w:ind w:left="2160" w:hanging="360"/>
+      </w:pPr>
+    </w:lvl>
+    <w:lvl w:ilvl="6">
+      <w:start w:val="1"/>
+      <w:numFmt w:val="bullet"/>
+      <w:lvlText w:val="•"/>
+      <w:lvlJc w:val="left"/>
+      <w:pPr>
+        <w:ind w:left="2520" w:hanging="360"/>
+      </w:pPr>
+    </w:lvl>
+    <w:lvl w:ilvl="7">
+      <w:start w:val="1"/>
+      <w:numFmt w:val="bullet"/>
+      <w:lvlText w:val="◦"/>
+      <w:lvlJc w:val="left"/>
+      <w:pPr>
+        <w:ind w:left="2880" w:hanging="360"/>
+      </w:pPr>
+    </w:lvl>
+    <w:lvl w:ilvl="8">
+      <w:start w:val="1"/>
+      <w:numFmt w:val="bullet"/>
+      <w:lvlText w:val="▪"/>
+      <w:lvlJc w:val="left"/>
+      <w:pPr>
+        <w:ind w:left="3240" w:hanging="360"/>
+      </w:pPr>
+    </w:lvl>
+  </w:abstractNum>
+  <w:abstractNum w:abstractNumId="1">
+    <w:multiLevelType w:val="hybridMultilevel"/>
+    <w:lvl w:ilvl="0">
+      <w:start w:val="1"/>
+      <w:numFmt w:val="decimal"/>
+      <w:pStyle w:val="ListNumber"/>
+      <w:lvlText w:val="%1."/>
+      <w:lvlJc w:val="left"/>
+      <w:pPr>
+        <w:ind w:left="360" w:hanging="360"/>
+      </w:pPr>
+    </w:lvl>
+    <w:lvl w:ilvl="1">
+      <w:start w:val="1"/>
+      <w:numFmt w:val="lowerLetter"/>
+      <w:lvlText w:val="%2."/>
+      <w:lvlJc w:val="left"/>
+      <w:pPr>
+        <w:ind w:left="720" w:hanging="360"/>
+      </w:pPr>
+    </w:lvl>
+    <w:lvl w:ilvl="2">
+      <w:start w:val="1"/>
+      <w:numFmt w:val="lowerRoman"/>
+      <w:lvlText w:val="%3."/>
+      <w:lvlJc w:val="left"/>
+      <w:pPr>
+        <w:ind w:left="1080" w:hanging="360"/>
+      </w:pPr>
+    </w:lvl>
+    <w:lvl w:ilvl="3">
+      <w:start w:val="1"/>
+      <w:numFmt w:val="decimal"/>
+      <w:lvlText w:val="%4."/>
+      <w:lvlJc w:val="left"/>
+      <w:pPr>
+        <w:ind w:left="1440" w:hanging="360"/>
+      </w:pPr>
+    </w:lvl>
+    <w:lvl w:ilvl="4">
+      <w:start w:val="1"/>
+      <w:numFmt w:val="lowerLetter"/>
+      <w:lvlText w:val="%5."/>
+      <w:lvlJc w:val="left"/>
+      <w:pPr>
+        <w:ind w:left="1800" w:hanging="360"/>
+      </w:pPr>
+    </w:lvl>
+    <w:lvl w:ilvl="5">
+      <w:start w:val="1"/>
+      <w:numFmt w:val="lowerRoman"/>
+      <w:lvlText w:val="%6."/>
+      <w:lvlJc w:val="left"/>
+      <w:pPr>
+        <w:ind w:left="2160" w:hanging="360"/>
+      </w:pPr>
+    </w:lvl>
+    <w:lvl w:ilvl="6">
+      <w:start w:val="1"/>
+      <w:numFmt w:val="decimal"/>
+      <w:lvlText w:val="%7."/>
+      <w:lvlJc w:val="left"/>
+      <w:pPr>
+        <w:ind w:left="2520" w:hanging="360"/>
+      </w:pPr>
+    </w:lvl>
+    <w:lvl w:ilvl="7">
+      <w:start w:val="1"/>
+      <w:numFmt w:val="lowerLetter"/>
+      <w:lvlText w:val="%8."/>
+      <w:lvlJc w:val="left"/>
+      <w:pPr>
+        <w:ind w:left="2880" w:hanging="360"/>
+      </w:pPr>
+    </w:lvl>
+    <w:lvl w:ilvl="8">
+      <w:start w:val="1"/>
+      <w:numFmt w:val="lowerRoman"/>
+      <w:lvlText w:val="%9."/>
+      <w:lvlJc w:val="left"/>
+      <w:pPr>
+        <w:ind w:left="3240" w:hanging="360"/>
+      </w:pPr>
+    </w:lvl>
+  </w:abstractNum>
+  <w:num w:numId="1">
+    <w:abstractNumId w:val="0"/>
+  </w:num>
+  <w:num w:numId="2">
+    <w:abstractNumId w:val="1"/>
+  </w:num>
+</w:numbering>
 </file>
 
 <file path=word/styles.xml><?xml version="1.0" encoding="utf-8"?>
@@ -1164,6 +1345,30 @@
     <w:semiHidden/>
     <w:unhideWhenUsed/>
   </w:style>
+  <w:style w:type="paragraph" w:styleId="ListBullet">
+    <w:name w:val="List Bullet"/>
+    <w:basedOn w:val="Normal"/>
+    <w:uiPriority w:val="99"/>
+    <w:unhideWhenUsed/>
+    <w:pPr>
+      <w:numPr>
+        <w:numId w:val="1"/>
+      </w:numPr>
+      <w:contextualSpacing/>
+    </w:pPr>
+  </w:style>
+  <w:style w:type="paragraph" w:styleId="ListNumber">
+    <w:name w:val="List Number"/>
+    <w:basedOn w:val="Normal"/>
+    <w:uiPriority w:val="99"/>
+    <w:unhideWhenUsed/>
+    <w:pPr>
+      <w:numPr>
+        <w:numId w:val="2"/>
+      </w:numPr>
+      <w:contextualSpacing/>
+    </w:pPr>
+  </w:style>
 </w:styles>
 </file>
 

</xml_diff>